<commit_message>
docs: Add GitHub deployment section to Korean development report
</commit_message>
<xml_diff>
--- a/docs/qwen3-vl-개발보고서.docx
+++ b/docs/qwen3-vl-개발보고서.docx
@@ -1875,7 +1875,930 @@
           <w:color w:val="1F497D"/>
           <w:sz w:val="32"/>
         </w:rPr>
-        <w:t>8. 환경변수 (.env)</w:t>
+        <w:t>8. GitHub 소스코드 공개</w:t>
+      </w:r>
+    </w:p>
+    <w:p>
+      <w:pPr>
+        <w:pBdr>
+          <w:bottom w:val="single" w:sz="6" w:space="1" w:color="AAAAAA"/>
+        </w:pBdr>
+        <w:spacing w:after="120"/>
+      </w:pPr>
+    </w:p>
+    <w:p>
+      <w:pPr>
+        <w:spacing w:after="80"/>
+      </w:pPr>
+      <w:r>
+        <w:rPr>
+          <w:rFonts w:eastAsia="맑은 고딕"/>
+          <w:rFonts w:ascii="맑은 고딕" w:hAnsi="맑은 고딕"/>
+          <w:b w:val="0"/>
+          <w:sz w:val="20"/>
+        </w:rPr>
+        <w:t>개발이 완료된 소스코드를 GitHub에 공개하였습니다. 공개 저장소 주소: https://github.com/handuru01/qwen3-vl</w:t>
+      </w:r>
+    </w:p>
+    <w:p>
+      <w:pPr>
+        <w:spacing w:before="240" w:after="80"/>
+        <w:jc w:val="left"/>
+      </w:pPr>
+      <w:r>
+        <w:rPr>
+          <w:rFonts w:eastAsia="맑은 고딕"/>
+          <w:rFonts w:ascii="맑은 고딕" w:hAnsi="맑은 고딕"/>
+          <w:b/>
+          <w:color w:val="1F4E79"/>
+          <w:sz w:val="26"/>
+        </w:rPr>
+        <w:t>8.1 사전 준비 — .gitignore / .env.example 생성</w:t>
+      </w:r>
+    </w:p>
+    <w:p>
+      <w:pPr>
+        <w:spacing w:after="80"/>
+      </w:pPr>
+      <w:r>
+        <w:rPr>
+          <w:rFonts w:eastAsia="맑은 고딕"/>
+          <w:rFonts w:ascii="맑은 고딕" w:hAnsi="맑은 고딕"/>
+          <w:b w:val="0"/>
+          <w:sz w:val="20"/>
+        </w:rPr>
+        <w:t>.env 파일에는 서버 주소 등 환경별 설정이 포함되므로 저장소에서 제외하고, 대신 .env.example 파일을 제공하여 사용자가 참고할 수 있도록 하였습니다.</w:t>
+      </w:r>
+    </w:p>
+    <w:p>
+      <w:pPr>
+        <w:spacing w:before="80" w:after="80"/>
+        <w:ind w:left="567"/>
+      </w:pPr>
+      <w:r>
+        <w:rPr>
+          <w:rFonts w:ascii="Courier New" w:hAnsi="Courier New"/>
+          <w:color w:val="1E1E1E"/>
+          <w:sz w:val="18"/>
+          <w:shd w:val="clear" w:color="auto" w:fill="F0F0F0"/>
+        </w:rPr>
+        <w:t># .gitignore 주요 항목</w:t>
+        <w:br/>
+        <w:t>.env          # 실제 환경변수 파일 제외</w:t>
+        <w:br/>
+        <w:t>__pycache__/</w:t>
+        <w:br/>
+        <w:t>*.pyc</w:t>
+        <w:br/>
+        <w:t>venv/</w:t>
+      </w:r>
+    </w:p>
+    <w:p>
+      <w:pPr>
+        <w:spacing w:before="80" w:after="80"/>
+        <w:ind w:left="567"/>
+      </w:pPr>
+      <w:r>
+        <w:rPr>
+          <w:rFonts w:ascii="Courier New" w:hAnsi="Courier New"/>
+          <w:color w:val="1E1E1E"/>
+          <w:sz w:val="18"/>
+          <w:shd w:val="clear" w:color="auto" w:fill="F0F0F0"/>
+        </w:rPr>
+        <w:t># .env.example</w:t>
+        <w:br/>
+        <w:t>OLLAMA_HOST=http://localhost:11434</w:t>
+        <w:br/>
+        <w:t>OLLAMA_MODEL=qwen3-vl:8b</w:t>
+        <w:br/>
+        <w:t>REQUEST_TIMEOUT=180</w:t>
+        <w:br/>
+        <w:t>MAX_IMAGE_BYTES=10485760</w:t>
+        <w:br/>
+        <w:t>APP_PORT=8001</w:t>
+      </w:r>
+    </w:p>
+    <w:p>
+      <w:pPr>
+        <w:spacing w:before="240" w:after="80"/>
+        <w:jc w:val="left"/>
+      </w:pPr>
+      <w:r>
+        <w:rPr>
+          <w:rFonts w:eastAsia="맑은 고딕"/>
+          <w:rFonts w:ascii="맑은 고딕" w:hAnsi="맑은 고딕"/>
+          <w:b/>
+          <w:color w:val="1F4E79"/>
+          <w:sz w:val="26"/>
+        </w:rPr>
+        <w:t>8.2 git 저장소 초기화</w:t>
+      </w:r>
+    </w:p>
+    <w:p>
+      <w:pPr>
+        <w:spacing w:after="80"/>
+      </w:pPr>
+      <w:r>
+        <w:rPr>
+          <w:rFonts w:eastAsia="맑은 고딕"/>
+          <w:rFonts w:ascii="맑은 고딕" w:hAnsi="맑은 고딕"/>
+          <w:b w:val="0"/>
+          <w:sz w:val="20"/>
+        </w:rPr>
+        <w:t>처음에는 상위 디렉토리(/mnt/data/handuru/)가 git 루트로 잡혀 파일 경로에 qwen3-vl/ 접두사가 붙는 문제가 발생하였습니다. 상위 디렉토리의 커밋을 되돌린 후 프로젝트 디렉토리 안에 git 저장소를 새로 초기화하여 해결하였습니다.</w:t>
+      </w:r>
+    </w:p>
+    <w:p>
+      <w:pPr>
+        <w:spacing w:before="80" w:after="80"/>
+        <w:ind w:left="567"/>
+      </w:pPr>
+      <w:r>
+        <w:rPr>
+          <w:rFonts w:ascii="Courier New" w:hAnsi="Courier New"/>
+          <w:color w:val="1E1E1E"/>
+          <w:sz w:val="18"/>
+          <w:shd w:val="clear" w:color="auto" w:fill="F0F0F0"/>
+        </w:rPr>
+        <w:t># 상위 디렉토리의 잘못된 커밋 되돌리기</w:t>
+        <w:br/>
+        <w:t>git -C /mnt/data/handuru update-ref -d HEAD</w:t>
+        <w:br/>
+        <w:br/>
+        <w:t># 프로젝트 디렉토리에 git 저장소 초기화</w:t>
+        <w:br/>
+        <w:t>git init /mnt/data/handuru/qwen3-vl</w:t>
+        <w:br/>
+        <w:t>git -C /mnt/data/handuru/qwen3-vl config user.name "handuru"</w:t>
+        <w:br/>
+        <w:t>git -C /mnt/data/handuru/qwen3-vl config user.email "hftsys@gmail.com"</w:t>
+        <w:br/>
+        <w:t>git -C /mnt/data/handuru/qwen3-vl branch -m main</w:t>
+      </w:r>
+    </w:p>
+    <w:p>
+      <w:pPr>
+        <w:spacing w:before="240" w:after="80"/>
+        <w:jc w:val="left"/>
+      </w:pPr>
+      <w:r>
+        <w:rPr>
+          <w:rFonts w:eastAsia="맑은 고딕"/>
+          <w:rFonts w:ascii="맑은 고딕" w:hAnsi="맑은 고딕"/>
+          <w:b/>
+          <w:color w:val="1F4E79"/>
+          <w:sz w:val="26"/>
+        </w:rPr>
+        <w:t>8.3 초기 커밋</w:t>
+      </w:r>
+    </w:p>
+    <w:p>
+      <w:pPr>
+        <w:spacing w:after="80"/>
+      </w:pPr>
+      <w:r>
+        <w:rPr>
+          <w:rFonts w:eastAsia="맑은 고딕"/>
+          <w:rFonts w:ascii="맑은 고딕" w:hAnsi="맑은 고딕"/>
+          <w:b w:val="0"/>
+          <w:sz w:val="20"/>
+        </w:rPr>
+        <w:t>11개 파일을 스테이징하고 커밋하였습니다. (.env는 .gitignore에 의해 자동 제외)</w:t>
+      </w:r>
+    </w:p>
+    <w:p>
+      <w:pPr>
+        <w:spacing w:before="80" w:after="80"/>
+        <w:ind w:left="567"/>
+      </w:pPr>
+      <w:r>
+        <w:rPr>
+          <w:rFonts w:ascii="Courier New" w:hAnsi="Courier New"/>
+          <w:color w:val="1E1E1E"/>
+          <w:sz w:val="18"/>
+          <w:shd w:val="clear" w:color="auto" w:fill="F0F0F0"/>
+        </w:rPr>
+        <w:t>git add .</w:t>
+        <w:br/>
+        <w:t>git commit -m "Initial commit: Qwen3-VL multimodal chat web service"</w:t>
+      </w:r>
+    </w:p>
+    <w:tbl>
+      <w:tblPr>
+        <w:tblStyle w:val="TableGrid"/>
+        <w:tblW w:type="auto" w:w="0"/>
+        <w:jc w:val="left"/>
+        <w:tblLook w:firstColumn="1" w:firstRow="1" w:lastColumn="0" w:lastRow="0" w:noHBand="0" w:noVBand="1" w:val="04A0"/>
+      </w:tblPr>
+      <w:tblGrid>
+        <w:gridCol w:w="4561"/>
+        <w:gridCol w:w="4561"/>
+      </w:tblGrid>
+      <w:tr>
+        <w:tc>
+          <w:tcPr>
+            <w:tcW w:type="dxa" w:w="4561"/>
+            <w:shd w:val="clear" w:color="auto" w:fill="1F497D"/>
+          </w:tcPr>
+          <w:p>
+            <w:r/>
+            <w:r>
+              <w:rPr>
+                <w:rFonts w:eastAsia="맑은 고딕"/>
+                <w:rFonts w:ascii="맑은 고딕" w:hAnsi="맑은 고딕"/>
+                <w:b/>
+                <w:color w:val="FFFFFF"/>
+                <w:sz w:val="20"/>
+              </w:rPr>
+              <w:t>커밋 포함 파일</w:t>
+            </w:r>
+          </w:p>
+        </w:tc>
+        <w:tc>
+          <w:tcPr>
+            <w:tcW w:type="dxa" w:w="4561"/>
+            <w:shd w:val="clear" w:color="auto" w:fill="1F497D"/>
+          </w:tcPr>
+          <w:p>
+            <w:r/>
+            <w:r>
+              <w:rPr>
+                <w:rFonts w:eastAsia="맑은 고딕"/>
+                <w:rFonts w:ascii="맑은 고딕" w:hAnsi="맑은 고딕"/>
+                <w:b/>
+                <w:color w:val="FFFFFF"/>
+                <w:sz w:val="20"/>
+              </w:rPr>
+              <w:t>설명</w:t>
+            </w:r>
+          </w:p>
+        </w:tc>
+      </w:tr>
+      <w:tr>
+        <w:tc>
+          <w:tcPr>
+            <w:tcW w:type="dxa" w:w="4561"/>
+            <w:shd w:val="clear" w:color="auto" w:fill="EAF0FB"/>
+          </w:tcPr>
+          <w:p>
+            <w:r/>
+            <w:r>
+              <w:rPr>
+                <w:rFonts w:eastAsia="맑은 고딕"/>
+                <w:rFonts w:ascii="맑은 고딕" w:hAnsi="맑은 고딕"/>
+                <w:b w:val="0"/>
+                <w:sz w:val="20"/>
+              </w:rPr>
+              <w:t>.env.example</w:t>
+            </w:r>
+          </w:p>
+        </w:tc>
+        <w:tc>
+          <w:tcPr>
+            <w:tcW w:type="dxa" w:w="4561"/>
+            <w:shd w:val="clear" w:color="auto" w:fill="EAF0FB"/>
+          </w:tcPr>
+          <w:p>
+            <w:r/>
+            <w:r>
+              <w:rPr>
+                <w:rFonts w:eastAsia="맑은 고딕"/>
+                <w:rFonts w:ascii="맑은 고딕" w:hAnsi="맑은 고딕"/>
+                <w:b w:val="0"/>
+                <w:sz w:val="20"/>
+              </w:rPr>
+              <w:t>환경변수 예시</w:t>
+            </w:r>
+          </w:p>
+        </w:tc>
+      </w:tr>
+      <w:tr>
+        <w:tc>
+          <w:tcPr>
+            <w:tcW w:type="dxa" w:w="4561"/>
+            <w:shd w:val="clear" w:color="auto" w:fill="FFFFFF"/>
+          </w:tcPr>
+          <w:p>
+            <w:r/>
+            <w:r>
+              <w:rPr>
+                <w:rFonts w:eastAsia="맑은 고딕"/>
+                <w:rFonts w:ascii="맑은 고딕" w:hAnsi="맑은 고딕"/>
+                <w:b w:val="0"/>
+                <w:sz w:val="20"/>
+              </w:rPr>
+              <w:t>.gitignore</w:t>
+            </w:r>
+          </w:p>
+        </w:tc>
+        <w:tc>
+          <w:tcPr>
+            <w:tcW w:type="dxa" w:w="4561"/>
+            <w:shd w:val="clear" w:color="auto" w:fill="FFFFFF"/>
+          </w:tcPr>
+          <w:p>
+            <w:r/>
+            <w:r>
+              <w:rPr>
+                <w:rFonts w:eastAsia="맑은 고딕"/>
+                <w:rFonts w:ascii="맑은 고딕" w:hAnsi="맑은 고딕"/>
+                <w:b w:val="0"/>
+                <w:sz w:val="20"/>
+              </w:rPr>
+              <w:t>git 제외 목록</w:t>
+            </w:r>
+          </w:p>
+        </w:tc>
+      </w:tr>
+      <w:tr>
+        <w:tc>
+          <w:tcPr>
+            <w:tcW w:type="dxa" w:w="4561"/>
+            <w:shd w:val="clear" w:color="auto" w:fill="EAF0FB"/>
+          </w:tcPr>
+          <w:p>
+            <w:r/>
+            <w:r>
+              <w:rPr>
+                <w:rFonts w:eastAsia="맑은 고딕"/>
+                <w:rFonts w:ascii="맑은 고딕" w:hAnsi="맑은 고딕"/>
+                <w:b w:val="0"/>
+                <w:sz w:val="20"/>
+              </w:rPr>
+              <w:t>CLAUDE.md</w:t>
+            </w:r>
+          </w:p>
+        </w:tc>
+        <w:tc>
+          <w:tcPr>
+            <w:tcW w:type="dxa" w:w="4561"/>
+            <w:shd w:val="clear" w:color="auto" w:fill="EAF0FB"/>
+          </w:tcPr>
+          <w:p>
+            <w:r/>
+            <w:r>
+              <w:rPr>
+                <w:rFonts w:eastAsia="맑은 고딕"/>
+                <w:rFonts w:ascii="맑은 고딕" w:hAnsi="맑은 고딕"/>
+                <w:b w:val="0"/>
+                <w:sz w:val="20"/>
+              </w:rPr>
+              <w:t>프로젝트 문서</w:t>
+            </w:r>
+          </w:p>
+        </w:tc>
+      </w:tr>
+      <w:tr>
+        <w:tc>
+          <w:tcPr>
+            <w:tcW w:type="dxa" w:w="4561"/>
+            <w:shd w:val="clear" w:color="auto" w:fill="FFFFFF"/>
+          </w:tcPr>
+          <w:p>
+            <w:r/>
+            <w:r>
+              <w:rPr>
+                <w:rFonts w:eastAsia="맑은 고딕"/>
+                <w:rFonts w:ascii="맑은 고딕" w:hAnsi="맑은 고딕"/>
+                <w:b w:val="0"/>
+                <w:sz w:val="20"/>
+              </w:rPr>
+              <w:t>Dockerfile</w:t>
+            </w:r>
+          </w:p>
+        </w:tc>
+        <w:tc>
+          <w:tcPr>
+            <w:tcW w:type="dxa" w:w="4561"/>
+            <w:shd w:val="clear" w:color="auto" w:fill="FFFFFF"/>
+          </w:tcPr>
+          <w:p>
+            <w:r/>
+            <w:r>
+              <w:rPr>
+                <w:rFonts w:eastAsia="맑은 고딕"/>
+                <w:rFonts w:ascii="맑은 고딕" w:hAnsi="맑은 고딕"/>
+                <w:b w:val="0"/>
+                <w:sz w:val="20"/>
+              </w:rPr>
+              <w:t>컨테이너 빌드</w:t>
+            </w:r>
+          </w:p>
+        </w:tc>
+      </w:tr>
+      <w:tr>
+        <w:tc>
+          <w:tcPr>
+            <w:tcW w:type="dxa" w:w="4561"/>
+            <w:shd w:val="clear" w:color="auto" w:fill="EAF0FB"/>
+          </w:tcPr>
+          <w:p>
+            <w:r/>
+            <w:r>
+              <w:rPr>
+                <w:rFonts w:eastAsia="맑은 고딕"/>
+                <w:rFonts w:ascii="맑은 고딕" w:hAnsi="맑은 고딕"/>
+                <w:b w:val="0"/>
+                <w:sz w:val="20"/>
+              </w:rPr>
+              <w:t>docker-compose.yml</w:t>
+            </w:r>
+          </w:p>
+        </w:tc>
+        <w:tc>
+          <w:tcPr>
+            <w:tcW w:type="dxa" w:w="4561"/>
+            <w:shd w:val="clear" w:color="auto" w:fill="EAF0FB"/>
+          </w:tcPr>
+          <w:p>
+            <w:r/>
+            <w:r>
+              <w:rPr>
+                <w:rFonts w:eastAsia="맑은 고딕"/>
+                <w:rFonts w:ascii="맑은 고딕" w:hAnsi="맑은 고딕"/>
+                <w:b w:val="0"/>
+                <w:sz w:val="20"/>
+              </w:rPr>
+              <w:t>Docker Compose 설정</w:t>
+            </w:r>
+          </w:p>
+        </w:tc>
+      </w:tr>
+      <w:tr>
+        <w:tc>
+          <w:tcPr>
+            <w:tcW w:type="dxa" w:w="4561"/>
+            <w:shd w:val="clear" w:color="auto" w:fill="FFFFFF"/>
+          </w:tcPr>
+          <w:p>
+            <w:r/>
+            <w:r>
+              <w:rPr>
+                <w:rFonts w:eastAsia="맑은 고딕"/>
+                <w:rFonts w:ascii="맑은 고딕" w:hAnsi="맑은 고딕"/>
+                <w:b w:val="0"/>
+                <w:sz w:val="20"/>
+              </w:rPr>
+              <w:t>apache-qwen3-vl.conf</w:t>
+            </w:r>
+          </w:p>
+        </w:tc>
+        <w:tc>
+          <w:tcPr>
+            <w:tcW w:type="dxa" w:w="4561"/>
+            <w:shd w:val="clear" w:color="auto" w:fill="FFFFFF"/>
+          </w:tcPr>
+          <w:p>
+            <w:r/>
+            <w:r>
+              <w:rPr>
+                <w:rFonts w:eastAsia="맑은 고딕"/>
+                <w:rFonts w:ascii="맑은 고딕" w:hAnsi="맑은 고딕"/>
+                <w:b w:val="0"/>
+                <w:sz w:val="20"/>
+              </w:rPr>
+              <w:t>Apache 설정 참고용</w:t>
+            </w:r>
+          </w:p>
+        </w:tc>
+      </w:tr>
+      <w:tr>
+        <w:tc>
+          <w:tcPr>
+            <w:tcW w:type="dxa" w:w="4561"/>
+            <w:shd w:val="clear" w:color="auto" w:fill="EAF0FB"/>
+          </w:tcPr>
+          <w:p>
+            <w:r/>
+            <w:r>
+              <w:rPr>
+                <w:rFonts w:eastAsia="맑은 고딕"/>
+                <w:rFonts w:ascii="맑은 고딕" w:hAnsi="맑은 고딕"/>
+                <w:b w:val="0"/>
+                <w:sz w:val="20"/>
+              </w:rPr>
+              <w:t>qwen3-vl.service</w:t>
+            </w:r>
+          </w:p>
+        </w:tc>
+        <w:tc>
+          <w:tcPr>
+            <w:tcW w:type="dxa" w:w="4561"/>
+            <w:shd w:val="clear" w:color="auto" w:fill="EAF0FB"/>
+          </w:tcPr>
+          <w:p>
+            <w:r/>
+            <w:r>
+              <w:rPr>
+                <w:rFonts w:eastAsia="맑은 고딕"/>
+                <w:rFonts w:ascii="맑은 고딕" w:hAnsi="맑은 고딕"/>
+                <w:b w:val="0"/>
+                <w:sz w:val="20"/>
+              </w:rPr>
+              <w:t>systemd 서비스 파일</w:t>
+            </w:r>
+          </w:p>
+        </w:tc>
+      </w:tr>
+      <w:tr>
+        <w:tc>
+          <w:tcPr>
+            <w:tcW w:type="dxa" w:w="4561"/>
+            <w:shd w:val="clear" w:color="auto" w:fill="FFFFFF"/>
+          </w:tcPr>
+          <w:p>
+            <w:r/>
+            <w:r>
+              <w:rPr>
+                <w:rFonts w:eastAsia="맑은 고딕"/>
+                <w:rFonts w:ascii="맑은 고딕" w:hAnsi="맑은 고딕"/>
+                <w:b w:val="0"/>
+                <w:sz w:val="20"/>
+              </w:rPr>
+              <w:t>main.py</w:t>
+            </w:r>
+          </w:p>
+        </w:tc>
+        <w:tc>
+          <w:tcPr>
+            <w:tcW w:type="dxa" w:w="4561"/>
+            <w:shd w:val="clear" w:color="auto" w:fill="FFFFFF"/>
+          </w:tcPr>
+          <w:p>
+            <w:r/>
+            <w:r>
+              <w:rPr>
+                <w:rFonts w:eastAsia="맑은 고딕"/>
+                <w:rFonts w:ascii="맑은 고딕" w:hAnsi="맑은 고딕"/>
+                <w:b w:val="0"/>
+                <w:sz w:val="20"/>
+              </w:rPr>
+              <w:t>FastAPI 백엔드</w:t>
+            </w:r>
+          </w:p>
+        </w:tc>
+      </w:tr>
+      <w:tr>
+        <w:tc>
+          <w:tcPr>
+            <w:tcW w:type="dxa" w:w="4561"/>
+            <w:shd w:val="clear" w:color="auto" w:fill="EAF0FB"/>
+          </w:tcPr>
+          <w:p>
+            <w:r/>
+            <w:r>
+              <w:rPr>
+                <w:rFonts w:eastAsia="맑은 고딕"/>
+                <w:rFonts w:ascii="맑은 고딕" w:hAnsi="맑은 고딕"/>
+                <w:b w:val="0"/>
+                <w:sz w:val="20"/>
+              </w:rPr>
+              <w:t>requirements.txt</w:t>
+            </w:r>
+          </w:p>
+        </w:tc>
+        <w:tc>
+          <w:tcPr>
+            <w:tcW w:type="dxa" w:w="4561"/>
+            <w:shd w:val="clear" w:color="auto" w:fill="EAF0FB"/>
+          </w:tcPr>
+          <w:p>
+            <w:r/>
+            <w:r>
+              <w:rPr>
+                <w:rFonts w:eastAsia="맑은 고딕"/>
+                <w:rFonts w:ascii="맑은 고딕" w:hAnsi="맑은 고딕"/>
+                <w:b w:val="0"/>
+                <w:sz w:val="20"/>
+              </w:rPr>
+              <w:t>Python 의존성</w:t>
+            </w:r>
+          </w:p>
+        </w:tc>
+      </w:tr>
+      <w:tr>
+        <w:tc>
+          <w:tcPr>
+            <w:tcW w:type="dxa" w:w="4561"/>
+            <w:shd w:val="clear" w:color="auto" w:fill="FFFFFF"/>
+          </w:tcPr>
+          <w:p>
+            <w:r/>
+            <w:r>
+              <w:rPr>
+                <w:rFonts w:eastAsia="맑은 고딕"/>
+                <w:rFonts w:ascii="맑은 고딕" w:hAnsi="맑은 고딕"/>
+                <w:b w:val="0"/>
+                <w:sz w:val="20"/>
+              </w:rPr>
+              <w:t>conversation.txt</w:t>
+            </w:r>
+          </w:p>
+        </w:tc>
+        <w:tc>
+          <w:tcPr>
+            <w:tcW w:type="dxa" w:w="4561"/>
+            <w:shd w:val="clear" w:color="auto" w:fill="FFFFFF"/>
+          </w:tcPr>
+          <w:p>
+            <w:r/>
+            <w:r>
+              <w:rPr>
+                <w:rFonts w:eastAsia="맑은 고딕"/>
+                <w:rFonts w:ascii="맑은 고딕" w:hAnsi="맑은 고딕"/>
+                <w:b w:val="0"/>
+                <w:sz w:val="20"/>
+              </w:rPr>
+              <w:t>개발 대화 기록</w:t>
+            </w:r>
+          </w:p>
+        </w:tc>
+      </w:tr>
+      <w:tr>
+        <w:tc>
+          <w:tcPr>
+            <w:tcW w:type="dxa" w:w="4561"/>
+            <w:shd w:val="clear" w:color="auto" w:fill="EAF0FB"/>
+          </w:tcPr>
+          <w:p>
+            <w:r/>
+            <w:r>
+              <w:rPr>
+                <w:rFonts w:eastAsia="맑은 고딕"/>
+                <w:rFonts w:ascii="맑은 고딕" w:hAnsi="맑은 고딕"/>
+                <w:b w:val="0"/>
+                <w:sz w:val="20"/>
+              </w:rPr>
+              <w:t>static/index.html</w:t>
+            </w:r>
+          </w:p>
+        </w:tc>
+        <w:tc>
+          <w:tcPr>
+            <w:tcW w:type="dxa" w:w="4561"/>
+            <w:shd w:val="clear" w:color="auto" w:fill="EAF0FB"/>
+          </w:tcPr>
+          <w:p>
+            <w:r/>
+            <w:r>
+              <w:rPr>
+                <w:rFonts w:eastAsia="맑은 고딕"/>
+                <w:rFonts w:ascii="맑은 고딕" w:hAnsi="맑은 고딕"/>
+                <w:b w:val="0"/>
+                <w:sz w:val="20"/>
+              </w:rPr>
+              <w:t>채팅 UI</w:t>
+            </w:r>
+          </w:p>
+        </w:tc>
+      </w:tr>
+    </w:tbl>
+    <w:p/>
+    <w:p>
+      <w:pPr>
+        <w:spacing w:before="240" w:after="80"/>
+        <w:jc w:val="left"/>
+      </w:pPr>
+      <w:r>
+        <w:rPr>
+          <w:rFonts w:eastAsia="맑은 고딕"/>
+          <w:rFonts w:ascii="맑은 고딕" w:hAnsi="맑은 고딕"/>
+          <w:b/>
+          <w:color w:val="1F4E79"/>
+          <w:sz w:val="26"/>
+        </w:rPr>
+        <w:t>8.4 GitHub 원격 저장소 연결 및 푸시</w:t>
+      </w:r>
+    </w:p>
+    <w:p>
+      <w:pPr>
+        <w:spacing w:after="80"/>
+      </w:pPr>
+      <w:r>
+        <w:rPr>
+          <w:rFonts w:eastAsia="맑은 고딕"/>
+          <w:rFonts w:ascii="맑은 고딕" w:hAnsi="맑은 고딕"/>
+          <w:b w:val="0"/>
+          <w:sz w:val="20"/>
+        </w:rPr>
+        <w:t>https://github.com/new 에서 저장소를 생성한 후 원격 저장소를 연결하고 푸시하였습니다. GitHub 인증은 Personal Access Token(PAT)을 사용합니다.</w:t>
+      </w:r>
+    </w:p>
+    <w:p>
+      <w:pPr>
+        <w:spacing w:before="80" w:after="80"/>
+        <w:ind w:left="567"/>
+      </w:pPr>
+      <w:r>
+        <w:rPr>
+          <w:rFonts w:ascii="Courier New" w:hAnsi="Courier New"/>
+          <w:color w:val="1E1E1E"/>
+          <w:sz w:val="18"/>
+          <w:shd w:val="clear" w:color="auto" w:fill="F0F0F0"/>
+        </w:rPr>
+        <w:t>git remote add origin https://github.com/handuru01/qwen3-vl.git</w:t>
+        <w:br/>
+        <w:t>git push -u origin main</w:t>
+      </w:r>
+    </w:p>
+    <w:p>
+      <w:pPr>
+        <w:spacing w:before="240" w:after="80"/>
+        <w:jc w:val="left"/>
+      </w:pPr>
+      <w:r>
+        <w:rPr>
+          <w:rFonts w:eastAsia="맑은 고딕"/>
+          <w:rFonts w:ascii="맑은 고딕" w:hAnsi="맑은 고딕"/>
+          <w:b/>
+          <w:color w:val="1F4E79"/>
+          <w:sz w:val="26"/>
+        </w:rPr>
+        <w:t>8.5 README 작성</w:t>
+      </w:r>
+    </w:p>
+    <w:p>
+      <w:pPr>
+        <w:spacing w:after="80"/>
+      </w:pPr>
+      <w:r>
+        <w:rPr>
+          <w:rFonts w:eastAsia="맑은 고딕"/>
+          <w:rFonts w:ascii="맑은 고딕" w:hAnsi="맑은 고딕"/>
+          <w:b w:val="0"/>
+          <w:sz w:val="20"/>
+        </w:rPr>
+        <w:t>GitHub 저장소 메인 화면에 표시될 README.md(영문)와 README.ko.md(한국어) 두 버전을 작성하였습니다.</w:t>
+      </w:r>
+    </w:p>
+    <w:p>
+      <w:pPr>
+        <w:pStyle w:val="ListBullet"/>
+        <w:spacing w:after="40"/>
+        <w:ind w:left="567"/>
+      </w:pPr>
+      <w:r>
+        <w:rPr>
+          <w:rFonts w:eastAsia="맑은 고딕"/>
+          <w:rFonts w:ascii="맑은 고딕" w:hAnsi="맑은 고딕"/>
+          <w:b w:val="0"/>
+          <w:sz w:val="20"/>
+        </w:rPr>
+        <w:t>README.md — 영문 (GitHub 기본 표시)</w:t>
+      </w:r>
+    </w:p>
+    <w:p>
+      <w:pPr>
+        <w:pStyle w:val="ListBullet"/>
+        <w:spacing w:after="40"/>
+        <w:ind w:left="567"/>
+      </w:pPr>
+      <w:r>
+        <w:rPr>
+          <w:rFonts w:eastAsia="맑은 고딕"/>
+          <w:rFonts w:ascii="맑은 고딕" w:hAnsi="맑은 고딕"/>
+          <w:b w:val="0"/>
+          <w:sz w:val="20"/>
+        </w:rPr>
+        <w:t>README.ko.md — 한국어</w:t>
+      </w:r>
+    </w:p>
+    <w:p>
+      <w:pPr>
+        <w:spacing w:before="240" w:after="80"/>
+        <w:jc w:val="left"/>
+      </w:pPr>
+      <w:r>
+        <w:rPr>
+          <w:rFonts w:eastAsia="맑은 고딕"/>
+          <w:rFonts w:ascii="맑은 고딕" w:hAnsi="맑은 고딕"/>
+          <w:b/>
+          <w:color w:val="1F4E79"/>
+          <w:sz w:val="26"/>
+        </w:rPr>
+        <w:t>8.6 docs/ 폴더 구성</w:t>
+      </w:r>
+    </w:p>
+    <w:p>
+      <w:pPr>
+        <w:spacing w:after="80"/>
+      </w:pPr>
+      <w:r>
+        <w:rPr>
+          <w:rFonts w:eastAsia="맑은 고딕"/>
+          <w:rFonts w:ascii="맑은 고딕" w:hAnsi="맑은 고딕"/>
+          <w:b w:val="0"/>
+          <w:sz w:val="20"/>
+        </w:rPr>
+        <w:t>개발보고서 및 문서 파일을 docs/ 폴더에 정리하여 GitHub에 함께 공개하였습니다.</w:t>
+      </w:r>
+    </w:p>
+    <w:p>
+      <w:pPr>
+        <w:spacing w:before="80" w:after="80"/>
+        <w:ind w:left="567"/>
+      </w:pPr>
+      <w:r>
+        <w:rPr>
+          <w:rFonts w:ascii="Courier New" w:hAnsi="Courier New"/>
+          <w:color w:val="1E1E1E"/>
+          <w:sz w:val="18"/>
+          <w:shd w:val="clear" w:color="auto" w:fill="F0F0F0"/>
+        </w:rPr>
+        <w:t>docs/</w:t>
+        <w:br/>
+        <w:t>├── README.txt                            # 영문 README 텍스트 버전</w:t>
+        <w:br/>
+        <w:t>├── qwen3-vl-개발보고서.docx               # 한국어 개발보고서</w:t>
+        <w:br/>
+        <w:t>└── qwen3-vl-development report-en-US.docx # 영문 개발보고서</w:t>
+      </w:r>
+    </w:p>
+    <w:p>
+      <w:pPr>
+        <w:spacing w:before="240" w:after="80"/>
+        <w:jc w:val="left"/>
+      </w:pPr>
+      <w:r>
+        <w:rPr>
+          <w:rFonts w:eastAsia="맑은 고딕"/>
+          <w:rFonts w:ascii="맑은 고딕" w:hAnsi="맑은 고딕"/>
+          <w:b/>
+          <w:color w:val="1F4E79"/>
+          <w:sz w:val="26"/>
+        </w:rPr>
+        <w:t>8.7 최종 GitHub 저장소 구성</w:t>
+      </w:r>
+    </w:p>
+    <w:p>
+      <w:pPr>
+        <w:spacing w:before="80" w:after="80"/>
+        <w:ind w:left="567"/>
+      </w:pPr>
+      <w:r>
+        <w:rPr>
+          <w:rFonts w:ascii="Courier New" w:hAnsi="Courier New"/>
+          <w:color w:val="1E1E1E"/>
+          <w:sz w:val="18"/>
+          <w:shd w:val="clear" w:color="auto" w:fill="F0F0F0"/>
+        </w:rPr>
+        <w:t>qwen3-vl/</w:t>
+        <w:br/>
+        <w:t>├── README.md                           ← 영문 (GitHub 메인)</w:t>
+        <w:br/>
+        <w:t>├── README.ko.md                        ← 한국어</w:t>
+        <w:br/>
+        <w:t>├── README.txt</w:t>
+        <w:br/>
+        <w:t>├── main.py</w:t>
+        <w:br/>
+        <w:t>├── requirements.txt</w:t>
+        <w:br/>
+        <w:t>├── .env.example</w:t>
+        <w:br/>
+        <w:t>├── .gitignore</w:t>
+        <w:br/>
+        <w:t>├── Dockerfile</w:t>
+        <w:br/>
+        <w:t>├── docker-compose.yml</w:t>
+        <w:br/>
+        <w:t>├── apache-qwen3-vl.conf</w:t>
+        <w:br/>
+        <w:t>├── qwen3-vl.service</w:t>
+        <w:br/>
+        <w:t>├── make_report.py</w:t>
+        <w:br/>
+        <w:t>├── CLAUDE.md</w:t>
+        <w:br/>
+        <w:t>├── conversation.txt</w:t>
+        <w:br/>
+        <w:t>├── docs/</w:t>
+        <w:br/>
+        <w:t>│   ├── README.txt</w:t>
+        <w:br/>
+        <w:t>│   ├── qwen3-vl-개발보고서.docx</w:t>
+        <w:br/>
+        <w:t>│   └── qwen3-vl-development report- en-US.docx</w:t>
+        <w:br/>
+        <w:t>└── static/</w:t>
+        <w:br/>
+        <w:t xml:space="preserve">    └── index.html</w:t>
+      </w:r>
+    </w:p>
+    <w:p>
+      <w:pPr>
+        <w:spacing w:before="360" w:after="120"/>
+        <w:jc w:val="left"/>
+      </w:pPr>
+      <w:r>
+        <w:rPr>
+          <w:rFonts w:eastAsia="맑은 고딕"/>
+          <w:rFonts w:ascii="맑은 고딕" w:hAnsi="맑은 고딕"/>
+          <w:b/>
+          <w:color w:val="1F497D"/>
+          <w:sz w:val="32"/>
+        </w:rPr>
+        <w:t>9. 환경변수 (.env)</w:t>
       </w:r>
     </w:p>
     <w:p>
@@ -2252,7 +3175,7 @@
           <w:color w:val="1F497D"/>
           <w:sz w:val="32"/>
         </w:rPr>
-        <w:t>9. 프로젝트 구조</w:t>
+        <w:t>10. 프로젝트 구조</w:t>
       </w:r>
     </w:p>
     <w:p>
@@ -2317,7 +3240,7 @@
           <w:color w:val="1F497D"/>
           <w:sz w:val="32"/>
         </w:rPr>
-        <w:t>10. 동작 확인</w:t>
+        <w:t>11. 동작 확인</w:t>
       </w:r>
     </w:p>
     <w:p>
@@ -2408,7 +3331,7 @@
           <w:color w:val="1F497D"/>
           <w:sz w:val="32"/>
         </w:rPr>
-        <w:t>11. 마치며</w:t>
+        <w:t>12. 마치며</w:t>
       </w:r>
     </w:p>
     <w:p>

</xml_diff>